<commit_message>
M10: batch export — POST /api/export(/batch), download UI, fix PLO/CLO heading double-prefix bug ✓
</commit_message>
<xml_diff>
--- a/full_pipeline_proof.docx
+++ b/full_pipeline_proof.docx
@@ -97,7 +97,7 @@
           <w:b w:val="0"/>
           <w:sz w:val="28"/>
         </w:rPr>
-        <w:t xml:space="preserve">อาจารย์ผู้สอน  อ.นพ.ปาณัสม์ ชูชีพวัฒนา      สังกัด สาขาวิชา สาขาวิชาสรีรวิทยา</w:t>
+        <w:t xml:space="preserve">อาจารย์ผู้สอน  อ.นพ.ปาณัสม์ ชูชีพวัฒนา      สังกัด สาขาวิชา สรีรวิทยา</w:t>
       </w:r>
     </w:p>
     <w:p>
@@ -2955,7 +2955,7 @@
           <w:b w:val="0"/>
           <w:sz w:val="26"/>
         </w:rPr>
-        <w:t xml:space="preserve">CLOCLO1 : อธิบายกลไกการทำงานของระบบต่าง ๆ ของร่างกาย และวิเคราะห์ความสัมพันธ์ของระบบเหล่านี้ในการคงภาวะสมดุล (homeostasis) ของร่างกายตามหลักสรีรวิทยา</w:t>
+        <w:t xml:space="preserve">CLO1 : อธิบายกลไกการทำงานของระบบต่าง ๆ ของร่างกาย และวิเคราะห์ความสัมพันธ์ของระบบเหล่านี้ในการคงภาวะสมดุล (homeostasis) ของร่างกายตามหลักสรีรวิทยา</w:t>
       </w:r>
     </w:p>
     <w:p>
@@ -2969,7 +2969,7 @@
           <w:b w:val="0"/>
           <w:sz w:val="26"/>
         </w:rPr>
-        <w:t xml:space="preserve">CLOCLO2 : ปฏิบัติการทดลองทางสรีรวิทยาพื้นฐานได้อย่างถูกต้อง</w:t>
+        <w:t xml:space="preserve">CLO2 : ปฏิบัติการทดลองทางสรีรวิทยาพื้นฐานได้อย่างถูกต้อง</w:t>
       </w:r>
     </w:p>
     <w:p>
@@ -2983,7 +2983,7 @@
           <w:b w:val="0"/>
           <w:sz w:val="26"/>
         </w:rPr>
-        <w:t xml:space="preserve">CLOCLO3 : ประยุกต์ใช้ความรู้ด้านสรีรวิทยาในการอธิบายภาวะปกติและความผิดปกติที่เกี่ยวข้อง</w:t>
+        <w:t xml:space="preserve">CLO3 : ประยุกต์ใช้ความรู้ด้านสรีรวิทยาในการอธิบายภาวะปกติและความผิดปกติที่เกี่ยวข้อง</w:t>
       </w:r>
     </w:p>
     <w:p>
@@ -2997,7 +2997,7 @@
           <w:b w:val="0"/>
           <w:sz w:val="26"/>
         </w:rPr>
-        <w:t xml:space="preserve">CLOCLO4 : ปฏิบัติการเรียนและกิจกรรมในรายวิชาด้วยความซื่อสัตย์ รับผิดชอบ มีวินัย และตรงต่อเวลา รวมถึงการส่งงาน การเข้าสอบ และการทำงานกลุ่มตามระเบียบของรายวิชา</w:t>
+        <w:t xml:space="preserve">CLO4 : ปฏิบัติการเรียนและกิจกรรมในรายวิชาด้วยความซื่อสัตย์ รับผิดชอบ มีวินัย และตรงต่อเวลา รวมถึงการส่งงาน การเข้าสอบ และการทำงานกลุ่มตามระเบียบของรายวิชา</w:t>
       </w:r>
     </w:p>
     <w:p>

</xml_diff>